<commit_message>
chore(docx): regenerar los tres manuales que D-23 dejo caducados
El .docx no se regenera solo: 14_Manual_App_Movil_IOT_VIAL, 3_Protocolo_Pruebas
_Rigurosas y 8_Procedimiento_Modo_Degradado tenian el .md mas nuevo que su .docx
desde que entro la documentacion de D-23. El empaquetador solo mira que el .docx
EXISTA, asi que el funcional habria recibido tres Word sin el 5.8.

Detectado comparando marcas de tiempo .md contra .docx antes de armar el paquete,
que es la unica forma de verlo: git no lo lista porque los dos estan comiteados.

Co-Authored-By: Claude Opus 5 (1M context) <noreply@anthropic.com>
Claude-Session: https://claude.ai/code/session_016cuMnpxB2N4h5EGikKKXXp
</commit_message>
<xml_diff>
--- a/05_Funcional/8_Procedimiento_Modo_Degradado.docx
+++ b/05_Funcional/8_Procedimiento_Modo_Degradado.docx
@@ -12899,23 +12899,71 @@
           <w:color w:val="960000"/>
           <w:sz w:val="20"/>
         </w:rPr>
-        <w:t xml:space="preserve"> | **40 h** | 8 h | **El tope duro son 48 h en las dos.** Lo que cambia es cuándo avisa cada una, y **este documento publicaba sólo el número del Maestro para las dos puntas**. 🛑 **Por qué importa en obra y no es un detalle:** quien espere el aviso del Esclavo a las 44 h lo verá a las **40** y concluirá que el equipo va mal; y al revés, quien crea que el Maestro avisa a las 40 dará por perdida una ventana que todavía tiene. **Cuente 40 h para el Esclavo y 44 para el Maestro**, o más simple: **al primer aviso de cualquiera de las dos puntas, quedan al menos 4 h.** ~~⚠️ **La pantalla que mostraba </w:t>
-      </w:r>
-      <w:r>
-        <w:rPr>
-          <w:b w:val="0"/>
-          <w:color w:val="960000"/>
-          <w:sz w:val="20"/>
-        </w:rPr>
-        <w:t>AVISO: LIMITE 48h</w:t>
-      </w:r>
-      <w:r>
-        <w:rPr>
-          <w:rFonts w:ascii="Consolas" w:hAnsi="Consolas"/>
-          <w:color w:val="960000"/>
-          <w:sz w:val="20"/>
-        </w:rPr>
-        <w:t xml:space="preserve"> ya no se puede leer en el equipo** (</w:t>
+        <w:t xml:space="preserve"> | **40 h** | 8 h | **El tope duro son 48 h en las dos.** Lo que cambia es cuándo avisa cada una, y **este documento publicaba sólo el número del Maestro para las dos puntas**. 🔴 **Y LO QUE NINGUNA DE LAS DOS CONSTANTES ARREGLA, medido el 07/09: EL PLAZO NO SE PUEDE CONSULTAR. En el POSTE 2, ni el aviso ni la cuenta salen del equipo.** El firmware del Esclavo **sí sabe** cuánto hace de la última sincronización y si el plazo venció —</w:t>
+      </w:r>
+      <w:r>
+        <w:rPr>
+          <w:b w:val="0"/>
+          <w:color w:val="960000"/>
+          <w:sz w:val="20"/>
+        </w:rPr>
+        <w:t>degradado_msDesdeSync()</w:t>
+      </w:r>
+      <w:r>
+        <w:rPr>
+          <w:rFonts w:ascii="Consolas" w:hAnsi="Consolas"/>
+          <w:color w:val="960000"/>
+          <w:sz w:val="20"/>
+        </w:rPr>
+        <w:t xml:space="preserve">, </w:t>
+      </w:r>
+      <w:r>
+        <w:rPr>
+          <w:b w:val="0"/>
+          <w:color w:val="960000"/>
+          <w:sz w:val="20"/>
+        </w:rPr>
+        <w:t>degradado_syncVencida()</w:t>
+      </w:r>
+      <w:r>
+        <w:rPr>
+          <w:rFonts w:ascii="Consolas" w:hAnsi="Consolas"/>
+          <w:color w:val="960000"/>
+          <w:sz w:val="20"/>
+        </w:rPr>
+        <w:t xml:space="preserve">, </w:t>
+      </w:r>
+      <w:r>
+        <w:rPr>
+          <w:b w:val="0"/>
+          <w:color w:val="960000"/>
+          <w:sz w:val="20"/>
+        </w:rPr>
+        <w:t>degradado_avisoLimite()</w:t>
+      </w:r>
+      <w:r>
+        <w:rPr>
+          <w:rFonts w:ascii="Consolas" w:hAnsi="Consolas"/>
+          <w:color w:val="960000"/>
+          <w:sz w:val="20"/>
+        </w:rPr>
+        <w:t xml:space="preserve">—, y **el único llamador de los tres es </w:t>
+      </w:r>
+      <w:r>
+        <w:rPr>
+          <w:b w:val="0"/>
+          <w:color w:val="960000"/>
+          <w:sz w:val="20"/>
+        </w:rPr>
+        <w:t>Esclavo/src/menu.cpp</w:t>
+      </w:r>
+      <w:r>
+        <w:rPr>
+          <w:rFonts w:ascii="Consolas" w:hAnsi="Consolas"/>
+          <w:color w:val="960000"/>
+          <w:sz w:val="20"/>
+        </w:rPr>
+        <w:t xml:space="preserve">**, la pantalla del gabinete que </w:t>
       </w:r>
       <w:r>
         <w:rPr>
@@ -12931,11 +12979,178 @@
           <w:color w:val="960000"/>
           <w:sz w:val="20"/>
         </w:rPr>
+        <w:t xml:space="preserve"> retira del equipo. **No viajan en ninguna trama y no hay comando para pedirlos.** **Así que el plazo se lleva a mano:** al dejar un poste en Degradado **se anota la hora** y se vuelve **antes** de las 48 h. Lo único que el técnico verá por sí solo es el **resultado** cuando ya se cumplió: </w:t>
+      </w:r>
+      <w:r>
+        <w:rPr>
+          <w:b w:val="0"/>
+          <w:color w:val="960000"/>
+          <w:sz w:val="20"/>
+        </w:rPr>
+        <w:t>MODO:RENDIDO</w:t>
+      </w:r>
+      <w:r>
+        <w:rPr>
+          <w:rFonts w:ascii="Consolas" w:hAnsi="Consolas"/>
+          <w:color w:val="960000"/>
+          <w:sz w:val="20"/>
+        </w:rPr>
+        <w:t xml:space="preserve"> y la luz en ámbar. 🆕 **Es el hueco que </w:t>
+      </w:r>
+      <w:r>
+        <w:rPr>
+          <w:b w:val="0"/>
+          <w:color w:val="960000"/>
+          <w:sz w:val="20"/>
+        </w:rPr>
+        <w:t>DECISIONES.md</w:t>
+      </w:r>
+      <w:r>
+        <w:rPr>
+          <w:rFonts w:ascii="Consolas" w:hAnsi="Consolas"/>
+          <w:color w:val="960000"/>
+          <w:sz w:val="20"/>
+        </w:rPr>
+        <w:t xml:space="preserve"> </w:t>
+      </w:r>
+      <w:r>
+        <w:rPr>
+          <w:b w:val="0"/>
+          <w:color w:val="960000"/>
+          <w:sz w:val="20"/>
+        </w:rPr>
+        <w:t>D-23</w:t>
+      </w:r>
+      <w:r>
+        <w:rPr>
+          <w:rFonts w:ascii="Consolas" w:hAnsi="Consolas"/>
+          <w:color w:val="960000"/>
+          <w:sz w:val="20"/>
+        </w:rPr>
+        <w:t xml:space="preserve"> viene a cerrar — decidida el 07/09 y SIN CONSTRUIR**; el censo de lo que haría falta está en </w:t>
+      </w:r>
+      <w:r>
+        <w:rPr>
+          <w:b w:val="0"/>
+          <w:color w:val="960000"/>
+          <w:sz w:val="20"/>
+        </w:rPr>
+        <w:t>14_Manual_App_Movil_IOT_VIAL.md` §5.8.</w:t>
+      </w:r>
+    </w:p>
+    <w:p>
+      <w:pPr>
+        <w:spacing w:after="160"/>
+        <w:ind w:left="360"/>
+        <w:shd w:val="clear" w:fill="FFF4E5"/>
+      </w:pPr>
+      <w:r>
+        <w:rPr>
+          <w:b w:val="0"/>
+          <w:color w:val="960000"/>
+          <w:sz w:val="20"/>
+        </w:rPr>
+        <w:t xml:space="preserve">🛑 </w:t>
+      </w:r>
+      <w:r>
+        <w:rPr>
+          <w:b/>
+          <w:color w:val="960000"/>
+          <w:sz w:val="20"/>
+        </w:rPr>
+        <w:t>Por qué importa en obra y no es un detalle:</w:t>
+      </w:r>
+      <w:r>
+        <w:rPr>
+          <w:b w:val="0"/>
+          <w:color w:val="960000"/>
+          <w:sz w:val="20"/>
+        </w:rPr>
+        <w:t xml:space="preserve"> quien espere el aviso del Esclavo a las 44 h lo verá a las </w:t>
+      </w:r>
+      <w:r>
+        <w:rPr>
+          <w:b/>
+          <w:color w:val="960000"/>
+          <w:sz w:val="20"/>
+        </w:rPr>
+        <w:t>40</w:t>
+      </w:r>
+      <w:r>
+        <w:rPr>
+          <w:b w:val="0"/>
+          <w:color w:val="960000"/>
+          <w:sz w:val="20"/>
+        </w:rPr>
+        <w:t xml:space="preserve"> y concluirá que el equipo va mal; y al revés, quien crea que el Maestro avisa a las 40 dará por perdida una ventana que todavía tiene. </w:t>
+      </w:r>
+      <w:r>
+        <w:rPr>
+          <w:b/>
+          <w:color w:val="960000"/>
+          <w:sz w:val="20"/>
+        </w:rPr>
+        <w:t>Cuente 40 h para el Esclavo y 44 para el Maestro</w:t>
+      </w:r>
+      <w:r>
+        <w:rPr>
+          <w:b w:val="0"/>
+          <w:color w:val="960000"/>
+          <w:sz w:val="20"/>
+        </w:rPr>
+        <w:t xml:space="preserve">, o más simple: </w:t>
+      </w:r>
+      <w:r>
+        <w:rPr>
+          <w:b/>
+          <w:color w:val="960000"/>
+          <w:sz w:val="20"/>
+        </w:rPr>
+        <w:t>al primer aviso de cualquiera de las dos puntas, quedan al menos 4 h.</w:t>
+      </w:r>
+      <w:r>
+        <w:rPr>
+          <w:b w:val="0"/>
+          <w:color w:val="960000"/>
+          <w:sz w:val="20"/>
+        </w:rPr>
+        <w:t xml:space="preserve"> ~~⚠️ </w:t>
+      </w:r>
+      <w:r>
+        <w:rPr>
+          <w:b/>
+          <w:color w:val="960000"/>
+          <w:sz w:val="20"/>
+        </w:rPr>
+        <w:t>La pantalla que mostraba `AVISO: LIMITE 48h` ya no se puede leer en el equipo</w:t>
+      </w:r>
+      <w:r>
+        <w:rPr>
+          <w:b w:val="0"/>
+          <w:color w:val="960000"/>
+          <w:sz w:val="20"/>
+        </w:rPr>
+        <w:t xml:space="preserve"> (</w:t>
+      </w:r>
+      <w:r>
+        <w:rPr>
+          <w:rFonts w:ascii="Consolas" w:hAnsi="Consolas"/>
+          <w:color w:val="960000"/>
+          <w:sz w:val="20"/>
+        </w:rPr>
+        <w:t>D-17.bis</w:t>
+      </w:r>
+      <w:r>
+        <w:rPr>
+          <w:b w:val="0"/>
+          <w:color w:val="960000"/>
+          <w:sz w:val="20"/>
+        </w:rPr>
         <w:t xml:space="preserve">): lo que hay que mirar es el </w:t>
       </w:r>
       <w:r>
         <w:rPr>
-          <w:b w:val="0"/>
+          <w:rFonts w:ascii="Consolas" w:hAnsi="Consolas"/>
           <w:color w:val="960000"/>
           <w:sz w:val="20"/>
         </w:rPr>
@@ -12943,34 +13158,59 @@
       </w:r>
       <w:r>
         <w:rPr>
-          <w:rFonts w:ascii="Consolas" w:hAnsi="Consolas"/>
-          <w:color w:val="960000"/>
-          <w:sz w:val="20"/>
-        </w:rPr>
-        <w:t xml:space="preserve"> en la app.~~ &gt; # 🔴 TACHADO EL 07/09 — **EL AVISO NO ESTÁ EN EL </w:t>
-      </w:r>
-      <w:r>
-        <w:rPr>
-          <w:b w:val="0"/>
-          <w:color w:val="960000"/>
-          <w:sz w:val="20"/>
-        </w:rPr>
-        <w:t>STATUS</w:t>
-      </w:r>
-      <w:r>
-        <w:rPr>
-          <w:rFonts w:ascii="Consolas" w:hAnsi="Consolas"/>
-          <w:color w:val="960000"/>
-          <w:sz w:val="20"/>
-        </w:rPr>
-        <w:t xml:space="preserve">. HOY NO HAY NINGUNA FORMA DE VERLO** &gt; &gt; La primera mitad era cierta; **la segunda mandaba a mirar donde no está**, que es peor que no &gt; decir nada. Medido el 07/09, por los dos lados: &gt; &gt; **1. Los getters del aviso tienen UN SOLO llamador, y es la pantalla retirada:** &gt; &gt; </w:t>
-      </w:r>
-      <w:r>
-        <w:rPr>
-          <w:rFonts w:ascii="Consolas" w:hAnsi="Consolas"/>
-          <w:color w:val="960000"/>
-          <w:sz w:val="20"/>
-        </w:rPr>
+          <w:b w:val="0"/>
+          <w:color w:val="960000"/>
+          <w:sz w:val="20"/>
+        </w:rPr>
+        <w:t xml:space="preserve"> en la app.~~ &gt; # 🔴 TACHADO EL 07/09 — </w:t>
+      </w:r>
+      <w:r>
+        <w:rPr>
+          <w:b/>
+          <w:color w:val="960000"/>
+          <w:sz w:val="20"/>
+        </w:rPr>
+        <w:t>EL AVISO NO ESTÁ EN EL `STATUS`. HOY NO HAY NINGUNA FORMA DE VERLO</w:t>
+      </w:r>
+      <w:r>
+        <w:rPr>
+          <w:b w:val="0"/>
+          <w:color w:val="960000"/>
+          <w:sz w:val="20"/>
+        </w:rPr>
+        <w:t xml:space="preserve"> &gt; &gt; La primera mitad era cierta; </w:t>
+      </w:r>
+      <w:r>
+        <w:rPr>
+          <w:b/>
+          <w:color w:val="960000"/>
+          <w:sz w:val="20"/>
+        </w:rPr>
+        <w:t>la segunda mandaba a mirar donde no está</w:t>
+      </w:r>
+      <w:r>
+        <w:rPr>
+          <w:b w:val="0"/>
+          <w:color w:val="960000"/>
+          <w:sz w:val="20"/>
+        </w:rPr>
+        <w:t xml:space="preserve">, que es peor que no &gt; decir nada. Medido el 07/09, por los dos lados: &gt; &gt; </w:t>
+      </w:r>
+      <w:r>
+        <w:rPr>
+          <w:b/>
+          <w:color w:val="960000"/>
+          <w:sz w:val="20"/>
+        </w:rPr>
+        <w:t>1. Los getters del aviso tienen UN SOLO llamador, y es la pantalla retirada:</w:t>
+      </w:r>
+      <w:r>
+        <w:rPr>
+          <w:b w:val="0"/>
+          <w:color w:val="960000"/>
+          <w:sz w:val="20"/>
+        </w:rPr>
+        <w:t xml:space="preserve"> &gt; &gt; ``</w:t>
       </w:r>
       <w:r>
         <w:rPr>
@@ -23019,7 +23259,214 @@
           <w:color w:val="960000"/>
           <w:sz w:val="20"/>
         </w:rPr>
-        <w:t xml:space="preserve"> ni la app tienen hoy dónde decir *«el reloj de este poste no es fiable»* | ⚠️ </w:t>
+        <w:t xml:space="preserve"> ni la app tienen hoy dónde decir *«el reloj de este poste no es fiable»* | 🆕 </w:t>
+      </w:r>
+      <w:r>
+        <w:rPr>
+          <w:b/>
+          <w:color w:val="960000"/>
+          <w:sz w:val="20"/>
+        </w:rPr>
+        <w:t>07/09 — LA PIEZA `C` YA TIENE DUEÑO, Y NO ES FIRMWARE: `DECISIONES.md` fila `D-23`.</w:t>
+      </w:r>
+      <w:r>
+        <w:rPr>
+          <w:b w:val="0"/>
+          <w:color w:val="960000"/>
+          <w:sz w:val="20"/>
+        </w:rPr>
+        <w:t xml:space="preserve"> *«La app necesita una pantalla propia del poste 2»* —el diagnóstico de esa punta </w:t>
+      </w:r>
+      <w:r>
+        <w:rPr>
+          <w:b/>
+          <w:color w:val="960000"/>
+          <w:sz w:val="20"/>
+        </w:rPr>
+        <w:t>cuando el teléfono se conecta por Bluetooth directamente a ella</w:t>
+      </w:r>
+      <w:r>
+        <w:rPr>
+          <w:b w:val="0"/>
+          <w:color w:val="960000"/>
+          <w:sz w:val="20"/>
+        </w:rPr>
+        <w:t xml:space="preserve">, no a través del Poste 1—. Y con eso la propia fila </w:t>
+      </w:r>
+      <w:r>
+        <w:rPr>
+          <w:rFonts w:ascii="Consolas" w:hAnsi="Consolas"/>
+          <w:color w:val="960000"/>
+          <w:sz w:val="20"/>
+        </w:rPr>
+        <w:t>D-21</w:t>
+      </w:r>
+      <w:r>
+        <w:rPr>
+          <w:b w:val="0"/>
+          <w:color w:val="960000"/>
+          <w:sz w:val="20"/>
+        </w:rPr>
+        <w:t xml:space="preserve"> cierra la duda de si además hay que </w:t>
+      </w:r>
+      <w:r>
+        <w:rPr>
+          <w:b/>
+          <w:color w:val="960000"/>
+          <w:sz w:val="20"/>
+        </w:rPr>
+        <w:t>salir</w:t>
+      </w:r>
+      <w:r>
+        <w:rPr>
+          <w:b w:val="0"/>
+          <w:color w:val="960000"/>
+          <w:sz w:val="20"/>
+        </w:rPr>
+        <w:t xml:space="preserve"> del modo: </w:t>
+      </w:r>
+      <w:r>
+        <w:rPr>
+          <w:b/>
+          <w:color w:val="960000"/>
+          <w:sz w:val="20"/>
+        </w:rPr>
+        <w:t>no hace falta que el equipo lo decida solo, porque el Maestro reenvía la hora periódicamente y para que esa hora se vuelva mentirosa tendrían que pasar MESES. Lo que hace falta es poder DIAGNOSTICARLO cuando alguien vaya.</w:t>
+      </w:r>
+      <w:r>
+        <w:rPr>
+          <w:b w:val="0"/>
+          <w:color w:val="960000"/>
+          <w:sz w:val="20"/>
+        </w:rPr>
+        <w:t xml:space="preserve"> 🛑 </w:t>
+      </w:r>
+      <w:r>
+        <w:rPr>
+          <w:b/>
+          <w:color w:val="960000"/>
+          <w:sz w:val="20"/>
+        </w:rPr>
+        <w:t>`D-23` está DECIDIDA Y SIN CONSTRUIR — ni una línea, ni en la app ni en el firmware.</w:t>
+      </w:r>
+      <w:r>
+        <w:rPr>
+          <w:b w:val="0"/>
+          <w:color w:val="960000"/>
+          <w:sz w:val="20"/>
+        </w:rPr>
+        <w:t xml:space="preserve"> Lo que SÍ está medido —qué publica y qué acepta hoy esa punta por Bluetooth, y qué datos ya calcula sin que nadie pueda leerlos— está en </w:t>
+      </w:r>
+      <w:r>
+        <w:rPr>
+          <w:rFonts w:ascii="Consolas" w:hAnsi="Consolas"/>
+          <w:color w:val="960000"/>
+          <w:sz w:val="20"/>
+        </w:rPr>
+        <w:t>05_Funcional/14_Manual_App_Movil_IOT_VIAL.md</w:t>
+      </w:r>
+      <w:r>
+        <w:rPr>
+          <w:b w:val="0"/>
+          <w:color w:val="960000"/>
+          <w:sz w:val="20"/>
+        </w:rPr>
+        <w:t xml:space="preserve"> </w:t>
+      </w:r>
+      <w:r>
+        <w:rPr>
+          <w:b/>
+          <w:color w:val="960000"/>
+          <w:sz w:val="20"/>
+        </w:rPr>
+        <w:t>§5.8</w:t>
+      </w:r>
+      <w:r>
+        <w:rPr>
+          <w:b w:val="0"/>
+          <w:color w:val="960000"/>
+          <w:sz w:val="20"/>
+        </w:rPr>
+        <w:t xml:space="preserve">. ⚠️ </w:t>
+      </w:r>
+      <w:r>
+        <w:rPr>
+          <w:b/>
+          <w:color w:val="960000"/>
+          <w:sz w:val="20"/>
+        </w:rPr>
+        <w:t>Y no releva de nada de lo de abajo:</w:t>
+      </w:r>
+      <w:r>
+        <w:rPr>
+          <w:b w:val="0"/>
+          <w:color w:val="960000"/>
+          <w:sz w:val="20"/>
+        </w:rPr>
+        <w:t xml:space="preserve"> </w:t>
+      </w:r>
+      <w:r>
+        <w:rPr>
+          <w:rFonts w:ascii="Consolas" w:hAnsi="Consolas"/>
+          <w:color w:val="960000"/>
+          <w:sz w:val="20"/>
+        </w:rPr>
+        <w:t>D-23</w:t>
+      </w:r>
+      <w:r>
+        <w:rPr>
+          <w:b w:val="0"/>
+          <w:color w:val="960000"/>
+          <w:sz w:val="20"/>
+        </w:rPr>
+        <w:t xml:space="preserve"> hace </w:t>
+      </w:r>
+      <w:r>
+        <w:rPr>
+          <w:b/>
+          <w:color w:val="960000"/>
+          <w:sz w:val="20"/>
+        </w:rPr>
+        <w:t>visible</w:t>
+      </w:r>
+      <w:r>
+        <w:rPr>
+          <w:b w:val="0"/>
+          <w:color w:val="960000"/>
+          <w:sz w:val="20"/>
+        </w:rPr>
+        <w:t xml:space="preserve"> el fallo; </w:t>
+      </w:r>
+      <w:r>
+        <w:rPr>
+          <w:b/>
+          <w:color w:val="960000"/>
+          <w:sz w:val="20"/>
+        </w:rPr>
+        <w:t>las piezas `A` y `B` siguen siendo las que hacen que el equipo REACCIONE.</w:t>
+      </w:r>
+      <w:r>
+        <w:rPr>
+          <w:b w:val="0"/>
+          <w:color w:val="960000"/>
+          <w:sz w:val="20"/>
+        </w:rPr>
+        <w:t xml:space="preserve"> Una pantalla no pone un ámbar.</w:t>
+      </w:r>
+    </w:p>
+    <w:p>
+      <w:pPr>
+        <w:spacing w:after="160"/>
+        <w:ind w:left="360"/>
+        <w:shd w:val="clear" w:fill="FFF4E5"/>
+      </w:pPr>
+      <w:r>
+        <w:rPr>
+          <w:b w:val="0"/>
+          <w:color w:val="960000"/>
+          <w:sz w:val="20"/>
+        </w:rPr>
+        <w:t xml:space="preserve">⚠️ </w:t>
       </w:r>
       <w:r>
         <w:rPr>
@@ -27746,6 +28193,351 @@
           <w:b w:val="0"/>
           <w:sz w:val="21"/>
         </w:rPr>
+        <w:t xml:space="preserve">🛑 </w:t>
+      </w:r>
+      <w:r>
+        <w:rPr>
+          <w:b/>
+          <w:sz w:val="21"/>
+        </w:rPr>
+        <w:t>`D-23` (07/09): EL DIAGNÓSTICO DEL POSTE 2 POR SÍ MISMO NO EXISTE TODAVÍA.</w:t>
+      </w:r>
+      <w:r>
+        <w:rPr>
+          <w:b w:val="0"/>
+          <w:sz w:val="21"/>
+        </w:rPr>
+        <w:t xml:space="preserve"> Está decidido</w:t>
+      </w:r>
+    </w:p>
+    <w:p>
+      <w:pPr>
+        <w:spacing w:after="120"/>
+      </w:pPr>
+      <w:r>
+        <w:rPr>
+          <w:b w:val="0"/>
+          <w:sz w:val="21"/>
+        </w:rPr>
+        <w:t>—*«la app, cuando se conecta a ese lado del Esclavo vía Bluetooth, podrá diagnosticarlo»*— y **no</w:t>
+      </w:r>
+    </w:p>
+    <w:p>
+      <w:pPr>
+        <w:spacing w:after="120"/>
+      </w:pPr>
+      <w:r>
+        <w:rPr>
+          <w:b w:val="0"/>
+          <w:sz w:val="21"/>
+        </w:rPr>
+        <w:t>hay ni una línea escrita</w:t>
+      </w:r>
+      <w:r>
+        <w:rPr>
+          <w:b/>
+          <w:sz w:val="21"/>
+        </w:rPr>
+        <w:t xml:space="preserve">. Mientras tanto, quien suba al Poste 2 tiene </w:t>
+      </w:r>
+      <w:r>
+        <w:rPr>
+          <w:b w:val="0"/>
+          <w:sz w:val="21"/>
+        </w:rPr>
+        <w:t>exactamente** esto: el</w:t>
+      </w:r>
+    </w:p>
+    <w:p>
+      <w:pPr>
+        <w:spacing w:after="120"/>
+      </w:pPr>
+      <w:r>
+        <w:rPr>
+          <w:rFonts w:ascii="Consolas" w:hAnsi="Consolas"/>
+          <w:sz w:val="21"/>
+        </w:rPr>
+        <w:t>$STATUS</w:t>
+      </w:r>
+      <w:r>
+        <w:rPr>
+          <w:b w:val="0"/>
+          <w:sz w:val="21"/>
+        </w:rPr>
+        <w:t xml:space="preserve"> cada 2 s (</w:t>
+      </w:r>
+      <w:r>
+        <w:rPr>
+          <w:rFonts w:ascii="Consolas" w:hAnsi="Consolas"/>
+          <w:sz w:val="21"/>
+        </w:rPr>
+        <w:t>MODO</w:t>
+      </w:r>
+      <w:r>
+        <w:rPr>
+          <w:b w:val="0"/>
+          <w:sz w:val="21"/>
+        </w:rPr>
+        <w:t xml:space="preserve"> · </w:t>
+      </w:r>
+      <w:r>
+        <w:rPr>
+          <w:rFonts w:ascii="Consolas" w:hAnsi="Consolas"/>
+          <w:sz w:val="21"/>
+        </w:rPr>
+        <w:t>ESTADO</w:t>
+      </w:r>
+      <w:r>
+        <w:rPr>
+          <w:b w:val="0"/>
+          <w:sz w:val="21"/>
+        </w:rPr>
+        <w:t xml:space="preserve"> · </w:t>
+      </w:r>
+      <w:r>
+        <w:rPr>
+          <w:rFonts w:ascii="Consolas" w:hAnsi="Consolas"/>
+          <w:sz w:val="21"/>
+        </w:rPr>
+        <w:t>HORA</w:t>
+      </w:r>
+      <w:r>
+        <w:rPr>
+          <w:b w:val="0"/>
+          <w:sz w:val="21"/>
+        </w:rPr>
+        <w:t xml:space="preserve"> · </w:t>
+      </w:r>
+      <w:r>
+        <w:rPr>
+          <w:rFonts w:ascii="Consolas" w:hAnsi="Consolas"/>
+          <w:sz w:val="21"/>
+        </w:rPr>
+        <w:t>PLUMA</w:t>
+      </w:r>
+      <w:r>
+        <w:rPr>
+          <w:b w:val="0"/>
+          <w:sz w:val="21"/>
+        </w:rPr>
+        <w:t xml:space="preserve"> · </w:t>
+      </w:r>
+      <w:r>
+        <w:rPr>
+          <w:rFonts w:ascii="Consolas" w:hAnsi="Consolas"/>
+          <w:sz w:val="21"/>
+        </w:rPr>
+        <w:t>CAM</w:t>
+      </w:r>
+      <w:r>
+        <w:rPr>
+          <w:b w:val="0"/>
+          <w:sz w:val="21"/>
+        </w:rPr>
+        <w:t xml:space="preserve">, con </w:t>
+      </w:r>
+      <w:r>
+        <w:rPr>
+          <w:rFonts w:ascii="Consolas" w:hAnsi="Consolas"/>
+          <w:sz w:val="21"/>
+        </w:rPr>
+        <w:t>T</w:t>
+      </w:r>
+      <w:r>
+        <w:rPr>
+          <w:b w:val="0"/>
+          <w:sz w:val="21"/>
+        </w:rPr>
+        <w:t>/</w:t>
+      </w:r>
+      <w:r>
+        <w:rPr>
+          <w:rFonts w:ascii="Consolas" w:hAnsi="Consolas"/>
+          <w:sz w:val="21"/>
+        </w:rPr>
+        <w:t>RF</w:t>
+      </w:r>
+      <w:r>
+        <w:rPr>
+          <w:b w:val="0"/>
+          <w:sz w:val="21"/>
+        </w:rPr>
+        <w:t>/</w:t>
+      </w:r>
+      <w:r>
+        <w:rPr>
+          <w:rFonts w:ascii="Consolas" w:hAnsi="Consolas"/>
+          <w:sz w:val="21"/>
+        </w:rPr>
+        <w:t>RTT</w:t>
+      </w:r>
+      <w:r>
+        <w:rPr>
+          <w:b w:val="0"/>
+          <w:sz w:val="21"/>
+        </w:rPr>
+        <w:t>/</w:t>
+      </w:r>
+      <w:r>
+        <w:rPr>
+          <w:rFonts w:ascii="Consolas" w:hAnsi="Consolas"/>
+          <w:sz w:val="21"/>
+        </w:rPr>
+        <w:t>BAT</w:t>
+      </w:r>
+      <w:r>
+        <w:rPr>
+          <w:b w:val="0"/>
+          <w:sz w:val="21"/>
+        </w:rPr>
+        <w:t xml:space="preserve"> en </w:t>
+      </w:r>
+      <w:r>
+        <w:rPr>
+          <w:rFonts w:ascii="Consolas" w:hAnsi="Consolas"/>
+          <w:sz w:val="21"/>
+        </w:rPr>
+        <w:t>--</w:t>
+      </w:r>
+    </w:p>
+    <w:p>
+      <w:pPr>
+        <w:spacing w:after="120"/>
+      </w:pPr>
+      <w:r>
+        <w:rPr>
+          <w:b w:val="0"/>
+          <w:sz w:val="21"/>
+        </w:rPr>
+        <w:t xml:space="preserve">porque esa punta </w:t>
+      </w:r>
+      <w:r>
+        <w:rPr>
+          <w:b/>
+          <w:sz w:val="21"/>
+        </w:rPr>
+        <w:t>no puede</w:t>
+      </w:r>
+      <w:r>
+        <w:rPr>
+          <w:b w:val="0"/>
+          <w:sz w:val="21"/>
+        </w:rPr>
+        <w:t xml:space="preserve"> medirlos), los </w:t>
+      </w:r>
+      <w:r>
+        <w:rPr>
+          <w:rFonts w:ascii="Consolas" w:hAnsi="Consolas"/>
+          <w:sz w:val="21"/>
+        </w:rPr>
+        <w:t>EVENT</w:t>
+      </w:r>
+      <w:r>
+        <w:rPr>
+          <w:b w:val="0"/>
+          <w:sz w:val="21"/>
+        </w:rPr>
+        <w:t xml:space="preserve"> y </w:t>
+      </w:r>
+      <w:r>
+        <w:rPr>
+          <w:rFonts w:ascii="Consolas" w:hAnsi="Consolas"/>
+          <w:sz w:val="21"/>
+        </w:rPr>
+        <w:t>ALARM</w:t>
+      </w:r>
+      <w:r>
+        <w:rPr>
+          <w:b w:val="0"/>
+          <w:sz w:val="21"/>
+        </w:rPr>
+        <w:t xml:space="preserve"> que el equipo emite por su cuenta,</w:t>
+      </w:r>
+    </w:p>
+    <w:p>
+      <w:pPr>
+        <w:spacing w:after="120"/>
+      </w:pPr>
+      <w:r>
+        <w:rPr>
+          <w:b w:val="0"/>
+          <w:sz w:val="21"/>
+        </w:rPr>
+        <w:t xml:space="preserve">y </w:t>
+      </w:r>
+      <w:r>
+        <w:rPr>
+          <w:b/>
+          <w:sz w:val="21"/>
+        </w:rPr>
+        <w:t>una sola consulta</w:t>
+      </w:r>
+      <w:r>
+        <w:rPr>
+          <w:b w:val="0"/>
+          <w:sz w:val="21"/>
+        </w:rPr>
+        <w:t xml:space="preserve">: </w:t>
+      </w:r>
+      <w:r>
+        <w:rPr>
+          <w:rFonts w:ascii="Consolas" w:hAnsi="Consolas"/>
+          <w:sz w:val="21"/>
+        </w:rPr>
+        <w:t>CMD:LEER_RTC</w:t>
+      </w:r>
+      <w:r>
+        <w:rPr>
+          <w:b w:val="0"/>
+          <w:sz w:val="21"/>
+        </w:rPr>
+        <w:t xml:space="preserve">. </w:t>
+      </w:r>
+      <w:r>
+        <w:rPr>
+          <w:b/>
+          <w:sz w:val="21"/>
+        </w:rPr>
+        <w:t>No hay forma de preguntarle cuánto le queda a las 48 h.</w:t>
+      </w:r>
+    </w:p>
+    <w:p>
+      <w:pPr>
+        <w:spacing w:after="120"/>
+      </w:pPr>
+      <w:r>
+        <w:rPr>
+          <w:b w:val="0"/>
+          <w:sz w:val="21"/>
+        </w:rPr>
+        <w:t xml:space="preserve">Censo completo en </w:t>
+      </w:r>
+      <w:r>
+        <w:rPr>
+          <w:rFonts w:ascii="Consolas" w:hAnsi="Consolas"/>
+          <w:sz w:val="21"/>
+        </w:rPr>
+        <w:t>14_Manual_App_Movil_IOT_VIAL.md</w:t>
+      </w:r>
+      <w:r>
+        <w:rPr>
+          <w:b w:val="0"/>
+          <w:sz w:val="21"/>
+        </w:rPr>
+        <w:t xml:space="preserve"> §5.8.</w:t>
+      </w:r>
+    </w:p>
+    <w:p>
+      <w:pPr>
+        <w:pStyle w:val="ListBullet"/>
+        <w:spacing w:after="60"/>
+        <w:ind w:left="360"/>
+      </w:pPr>
+      <w:r>
+        <w:rPr>
+          <w:b w:val="0"/>
+          <w:sz w:val="21"/>
+        </w:rPr>
         <w:t>~~</w:t>
       </w:r>
       <w:r>

</xml_diff>